<commit_message>
Site updated: 2023-04-25 09:55:07
</commit_message>
<xml_diff>
--- a/2023/04/16/关于unity中材质的导入/星野爱.docx
+++ b/2023/04/16/关于unity中材质的导入/星野爱.docx
@@ -412,7 +412,16 @@
           <w:rFonts w:hint="eastAsia"/>
           <w:lang w:val="en-US" w:eastAsia="zh-CN"/>
         </w:rPr>
-        <w:t>倒在血泊中的爱，对着两个孩子，说出了第一句，也是最后一句“我爱你们”。这是谎言吗？纵观这个说了无数“谎言”的女孩的一生，这句话，绝对不是谎言。这，就是真正的“爱”。</w:t>
+        <w:t>倒在血泊中的爱，对着两个孩子，说出了第一句，也是最后一句“我爱你们”。这是谎言吗？纵观这个说了无数“谎言”的女孩的一生，这句话，绝对不是谎言。这，就是真正的“</w:t>
+      </w:r>
+      <w:bookmarkStart w:id="0" w:name="_GoBack"/>
+      <w:bookmarkEnd w:id="0"/>
+      <w:r>
+        <w:rPr>
+          <w:rFonts w:hint="eastAsia"/>
+          <w:lang w:val="en-US" w:eastAsia="zh-CN"/>
+        </w:rPr>
+        <w:t>爱”。</w:t>
       </w:r>
     </w:p>
     <w:p>
@@ -465,8 +474,6 @@
           </wp:inline>
         </w:drawing>
       </w:r>
-      <w:bookmarkStart w:id="0" w:name="_GoBack"/>
-      <w:bookmarkEnd w:id="0"/>
     </w:p>
     <w:p>
       <w:pPr>

</xml_diff>